<commit_message>
Sincronizacao automatica - 16/10/2026 20:18:04,67
</commit_message>
<xml_diff>
--- a/Escopagem_prototipo/Satis/Escopo_Comercial_CRM_Satis.docx
+++ b/Escopagem_prototipo/Satis/Escopo_Comercial_CRM_Satis.docx
@@ -6126,6 +6126,7 @@
       <w:jc w:val="center"/>
     </w:pPr>
     <w:rPr>
+      <w:color w:val="2563EB"/>
       <w:rFonts w:asciiTheme="majorHAnsi" w:eastAsiaTheme="majorEastAsia" w:hAnsiTheme="majorHAnsi" w:cstheme="majorBidi"/>
       <w:sz w:val="56"/>
       <w:szCs w:val="56"/>
@@ -6157,6 +6158,7 @@
       </w:numPr>
     </w:pPr>
     <w:rPr>
+      <w:color w:val="2563EB"/>
       <w:rFonts w:eastAsiaTheme="majorEastAsia" w:cstheme="majorBidi"/>
       <w:spacing w:val="15"/>
       <w:sz w:val="28"/>
@@ -6261,7 +6263,7 @@
     </w:pPr>
     <w:rPr>
       <w:rFonts w:asciiTheme="majorHAnsi" w:eastAsiaTheme="majorEastAsia" w:hAnsiTheme="majorHAnsi" w:cstheme="majorBidi"/>
-      <w:color w:val="0F4761" w:themeColor="accent1" w:themeShade="BF"/>
+      <w:color w:val="2563EB" w:themeColor="accent1" w:themeShade="BF"/>
       <w:sz w:val="40"/>
       <w:szCs w:val="40"/>
     </w:rPr>
@@ -6284,7 +6286,7 @@
     </w:pPr>
     <w:rPr>
       <w:rFonts w:asciiTheme="majorHAnsi" w:eastAsiaTheme="majorEastAsia" w:hAnsiTheme="majorHAnsi" w:cstheme="majorBidi"/>
-      <w:color w:val="0F4761" w:themeColor="accent1" w:themeShade="BF"/>
+      <w:color w:val="2563EB" w:themeColor="accent1" w:themeShade="BF"/>
       <w:sz w:val="32"/>
       <w:szCs w:val="32"/>
     </w:rPr>
@@ -6307,7 +6309,7 @@
     </w:pPr>
     <w:rPr>
       <w:rFonts w:eastAsiaTheme="majorEastAsia" w:cstheme="majorBidi"/>
-      <w:color w:val="0F4761" w:themeColor="accent1" w:themeShade="BF"/>
+      <w:color w:val="2563EB" w:themeColor="accent1" w:themeShade="BF"/>
       <w:sz w:val="28"/>
       <w:szCs w:val="28"/>
     </w:rPr>
@@ -6332,7 +6334,7 @@
       <w:rFonts w:eastAsiaTheme="majorEastAsia" w:cstheme="majorBidi"/>
       <w:i/>
       <w:iCs/>
-      <w:color w:val="0F4761" w:themeColor="accent1" w:themeShade="BF"/>
+      <w:color w:val="2563EB" w:themeColor="accent1" w:themeShade="BF"/>
     </w:rPr>
   </w:style>
   <w:style w:type="paragraph" w:styleId="Heading5">
@@ -6353,7 +6355,7 @@
     </w:pPr>
     <w:rPr>
       <w:rFonts w:eastAsiaTheme="majorEastAsia" w:cstheme="majorBidi"/>
-      <w:color w:val="0F4761" w:themeColor="accent1" w:themeShade="BF"/>
+      <w:color w:val="2563EB" w:themeColor="accent1" w:themeShade="BF"/>
     </w:rPr>
   </w:style>
   <w:style w:type="paragraph" w:styleId="Heading6">
@@ -6376,7 +6378,7 @@
       <w:rFonts w:eastAsiaTheme="majorEastAsia" w:cstheme="majorBidi"/>
       <w:i/>
       <w:iCs/>
-      <w:color w:val="595959" w:themeColor="text1" w:themeTint="A6"/>
+      <w:color w:val="2563EB" w:themeColor="text1" w:themeTint="A6"/>
     </w:rPr>
   </w:style>
   <w:style w:type="paragraph" w:styleId="Heading7">
@@ -6681,7 +6683,7 @@
     <w:name w:val="Verbatim Char"/>
     <w:basedOn w:val="BodyTextChar"/>
     <w:rPr>
-      <w:rFonts w:ascii="Consolas" w:hAnsi="Consolas"/>
+      <w:rFonts w:ascii="Inter" w:hAnsi="Inter"/>
       <w:sz w:val="22"/>
     </w:rPr>
   </w:style>

</xml_diff>